<commit_message>
docs: add Nepal Sindhuli project context and Form 7 expert CV
The engagement is the Nepal Sindhuli Korea-Nepal Model Dairy Village PMC
consultancy, tendered by Korea Rural Community Corporation (not KOICA),
2026-2030, KRW 7.459bn. The founder participates as the reproduction expert.

- context/nepal-sindhuli-dairy-project-context.md: RFP terms, the eight expert
  fields and their scoring thresholds, the 12 별지 forms, evidence rules, and
  the open questions. CLAUDE.md points at it for any related output.
- deliverables/nepal-form7-expert-cv-ha-hyunje.md: Form 7 filled to the exact
  layout of the blank .hwpx, plus the evidence checklist the scoring depends on
- ET proposal reframed onto the real project: Nepal routing, local breed and
  liquid-nitrogen risks specific to Sindhuli, correct client name

Word versions regenerated for all three.

Co-Authored-By: Claude Opus 5 <noreply@anthropic.com>
Claude-Session: https://claude.ai/code/session_01XoYxAkSfRcM555ynDBrJKP
</commit_message>
<xml_diff>
--- a/deliverables/[ET파트] 성감별 수정란 생산·이송 및 현지 이식 사업 수행계획.docx
+++ b/deliverables/[ET파트] 성감별 수정란 생산·이송 및 현지 이식 사업 수행계획.docx
@@ -43,7 +43,97 @@
           <w:sz w:val="20"/>
           <w:szCs w:val="20"/>
         </w:rPr>
-        <w:t xml:space="preserve"> KOICA 【사업명】 — 수정란이식(ET) 파트 </w:t>
+        <w:t xml:space="preserve"> 네팔 신둘리 한-네팔 시범 낙농마을 낙농 생산성 및 가치사슬 향상 사업 (Enhancing Productivity and Dairy Value Chain in Nepal-Korea Model Dairy Village in Sindhuli) </w:t>
+      </w:r>
+      <w:r>
+        <w:rPr>
+          <w:rFonts w:ascii="Malgun Gothic" w:cs="Malgun Gothic" w:eastAsia="Malgun Gothic" w:hAnsi="Malgun Gothic"/>
+          <w:b/>
+          <w:bCs/>
+          <w:sz w:val="20"/>
+          <w:szCs w:val="20"/>
+        </w:rPr>
+        <w:t xml:space="preserve">발주처:</w:t>
+      </w:r>
+      <w:r>
+        <w:rPr>
+          <w:rFonts w:ascii="Malgun Gothic" w:cs="Malgun Gothic" w:eastAsia="Malgun Gothic" w:hAnsi="Malgun Gothic"/>
+          <w:sz w:val="20"/>
+          <w:szCs w:val="20"/>
+        </w:rPr>
+        <w:t xml:space="preserve"> 한국농어촌공사 글로벌사업처 · </w:t>
+      </w:r>
+      <w:r>
+        <w:rPr>
+          <w:rFonts w:ascii="Malgun Gothic" w:cs="Malgun Gothic" w:eastAsia="Malgun Gothic" w:hAnsi="Malgun Gothic"/>
+          <w:b/>
+          <w:bCs/>
+          <w:sz w:val="20"/>
+          <w:szCs w:val="20"/>
+        </w:rPr>
+        <w:t xml:space="preserve">PMC 용역</w:t>
+      </w:r>
+      <w:r>
+        <w:rPr>
+          <w:rFonts w:ascii="Malgun Gothic" w:cs="Malgun Gothic" w:eastAsia="Malgun Gothic" w:hAnsi="Malgun Gothic"/>
+          <w:sz w:val="20"/>
+          <w:szCs w:val="20"/>
+        </w:rPr>
+        <w:t xml:space="preserve"> (2026~2030, 5년) </w:t>
+      </w:r>
+      <w:r>
+        <w:rPr>
+          <w:rFonts w:ascii="Malgun Gothic" w:cs="Malgun Gothic" w:eastAsia="Malgun Gothic" w:hAnsi="Malgun Gothic"/>
+          <w:b/>
+          <w:bCs/>
+          <w:sz w:val="20"/>
+          <w:szCs w:val="20"/>
+        </w:rPr>
+        <w:t xml:space="preserve">대상지:</w:t>
+      </w:r>
+      <w:r>
+        <w:rPr>
+          <w:rFonts w:ascii="Malgun Gothic" w:cs="Malgun Gothic" w:eastAsia="Malgun Gothic" w:hAnsi="Malgun Gothic"/>
+          <w:sz w:val="20"/>
+          <w:szCs w:val="20"/>
+        </w:rPr>
+        <w:t xml:space="preserve"> 네팔 Bagmati Province, Sindhuli District, Kamalamai Municipality </w:t>
+      </w:r>
+      <w:r>
+        <w:rPr>
+          <w:rFonts w:ascii="Malgun Gothic" w:cs="Malgun Gothic" w:eastAsia="Malgun Gothic" w:hAnsi="Malgun Gothic"/>
+          <w:b/>
+          <w:bCs/>
+          <w:sz w:val="20"/>
+          <w:szCs w:val="20"/>
+        </w:rPr>
+        <w:t xml:space="preserve">해당 파트:</w:t>
+      </w:r>
+      <w:r>
+        <w:rPr>
+          <w:rFonts w:ascii="Malgun Gothic" w:cs="Malgun Gothic" w:eastAsia="Malgun Gothic" w:hAnsi="Malgun Gothic"/>
+          <w:sz w:val="20"/>
+          <w:szCs w:val="20"/>
+        </w:rPr>
+        <w:t xml:space="preserve"> 유우군 능력검정시스템 구축 — </w:t>
+      </w:r>
+      <w:r>
+        <w:rPr>
+          <w:rFonts w:ascii="Malgun Gothic" w:cs="Malgun Gothic" w:eastAsia="Malgun Gothic" w:hAnsi="Malgun Gothic"/>
+          <w:b/>
+          <w:bCs/>
+          <w:sz w:val="20"/>
+          <w:szCs w:val="20"/>
+        </w:rPr>
+        <w:t xml:space="preserve">수정란이식(ET) 분야</w:t>
+      </w:r>
+      <w:r>
+        <w:rPr>
+          <w:rFonts w:ascii="Malgun Gothic" w:cs="Malgun Gothic" w:eastAsia="Malgun Gothic" w:hAnsi="Malgun Gothic"/>
+          <w:sz w:val="20"/>
+          <w:szCs w:val="20"/>
+        </w:rPr>
+        <w:t xml:space="preserve"> </w:t>
       </w:r>
       <w:r>
         <w:rPr>
@@ -79,7 +169,25 @@
           <w:sz w:val="20"/>
           <w:szCs w:val="20"/>
         </w:rPr>
-        <w:t xml:space="preserve"> 고려동물병원 원장 / ㈜제네틱스 대표이사 하현제 (수의사) </w:t>
+        <w:t xml:space="preserve"> 고려동물병원 원장 / ㈜제네틱스 대표이사 하현제 (수의사) — 파견분야: </w:t>
+      </w:r>
+      <w:r>
+        <w:rPr>
+          <w:rFonts w:ascii="Malgun Gothic" w:cs="Malgun Gothic" w:eastAsia="Malgun Gothic" w:hAnsi="Malgun Gothic"/>
+          <w:b/>
+          <w:bCs/>
+          <w:sz w:val="20"/>
+          <w:szCs w:val="20"/>
+        </w:rPr>
+        <w:t xml:space="preserve">번식</w:t>
+      </w:r>
+      <w:r>
+        <w:rPr>
+          <w:rFonts w:ascii="Malgun Gothic" w:cs="Malgun Gothic" w:eastAsia="Malgun Gothic" w:hAnsi="Malgun Gothic"/>
+          <w:sz w:val="20"/>
+          <w:szCs w:val="20"/>
+        </w:rPr>
+        <w:t xml:space="preserve"> </w:t>
       </w:r>
       <w:r>
         <w:rPr>
@@ -97,7 +205,7 @@
           <w:sz w:val="20"/>
           <w:szCs w:val="20"/>
         </w:rPr>
-        <w:t xml:space="preserve"> 2026-07-31 · </w:t>
+        <w:t xml:space="preserve"> 2026-08-01 · </w:t>
       </w:r>
       <w:r>
         <w:rPr>
@@ -115,25 +223,7 @@
           <w:sz w:val="20"/>
           <w:szCs w:val="20"/>
         </w:rPr>
-        <w:t xml:space="preserve"> 본문 3장 + 부록 </w:t>
-      </w:r>
-      <w:r>
-        <w:rPr>
-          <w:rFonts w:ascii="Malgun Gothic" w:cs="Malgun Gothic" w:eastAsia="Malgun Gothic" w:hAnsi="Malgun Gothic"/>
-          <w:b/>
-          <w:bCs/>
-          <w:sz w:val="20"/>
-          <w:szCs w:val="20"/>
-        </w:rPr>
-        <w:t xml:space="preserve">적용 범위:</w:t>
-      </w:r>
-      <w:r>
-        <w:rPr>
-          <w:rFonts w:ascii="Malgun Gothic" w:cs="Malgun Gothic" w:eastAsia="Malgun Gothic" w:hAnsi="Malgun Gothic"/>
-          <w:sz w:val="20"/>
-          <w:szCs w:val="20"/>
-        </w:rPr>
-        <w:t xml:space="preserve"> 사업기간 4년, 대상국 【대상국명】</w:t>
+        <w:t xml:space="preserve"> 본문 3장 + 부록</w:t>
       </w:r>
     </w:p>
     <w:p>
@@ -2945,7 +3035,7 @@
           <w:sz w:val="20"/>
           <w:szCs w:val="20"/>
         </w:rPr>
-        <w:t xml:space="preserve"> 인천공항 → 【대상국】 직항 항공화물을 원칙으로 하되, 물량이 적거나 일정이 촉박한 경우 </w:t>
+        <w:t xml:space="preserve"> 인천공항 → 카트만두(네팔) 직항 또는 경유 항공화물을 원칙으로 하되, 물량이 적거나 일정이 촉박한 경우 </w:t>
       </w:r>
       <w:r>
         <w:rPr>
@@ -6885,15 +6975,33 @@
           <w:sz w:val="20"/>
           <w:szCs w:val="20"/>
         </w:rPr>
-        <w:t xml:space="preserve">KOICA 성과관리 양식(PDM, Project Design Matrix)의 산출(Output) – 성과(Outcome) – 영향(Impact) 구조에 그대로 대응</w:t>
-      </w:r>
-      <w:r>
-        <w:rPr>
-          <w:rFonts w:ascii="Malgun Gothic" w:cs="Malgun Gothic" w:eastAsia="Malgun Gothic" w:hAnsi="Malgun Gothic"/>
-          <w:sz w:val="20"/>
-          <w:szCs w:val="20"/>
-        </w:rPr>
-        <w:t xml:space="preserve">하도록 설계했습니다. 취합 시 PDM 표의 해당 칸에 옮겨 넣을 수 있습니다.</w:t>
+        <w:t xml:space="preserve">산출(Output) – 성과(Outcome) – 영향(Impact)</w:t>
+      </w:r>
+      <w:r>
+        <w:rPr>
+          <w:rFonts w:ascii="Malgun Gothic" w:cs="Malgun Gothic" w:eastAsia="Malgun Gothic" w:hAnsi="Malgun Gothic"/>
+          <w:sz w:val="20"/>
+          <w:szCs w:val="20"/>
+        </w:rPr>
+        <w:t xml:space="preserve"> 3단계로 구성하여 ODA 성과관리 양식(PDM 등)에 그대로 옮겨 넣을 수 있도록 설계했습니다. 사업 목적인 </w:t>
+      </w:r>
+      <w:r>
+        <w:rPr>
+          <w:rFonts w:ascii="Malgun Gothic" w:cs="Malgun Gothic" w:eastAsia="Malgun Gothic" w:hAnsi="Malgun Gothic"/>
+          <w:b/>
+          <w:bCs/>
+          <w:sz w:val="20"/>
+          <w:szCs w:val="20"/>
+        </w:rPr>
+        <w:t xml:space="preserve">낙농 생산성 향상 및 가치사슬 개선을 통한 빈곤 감소</w:t>
+      </w:r>
+      <w:r>
+        <w:rPr>
+          <w:rFonts w:ascii="Malgun Gothic" w:cs="Malgun Gothic" w:eastAsia="Malgun Gothic" w:hAnsi="Malgun Gothic"/>
+          <w:sz w:val="20"/>
+          <w:szCs w:val="20"/>
+        </w:rPr>
+        <w:t xml:space="preserve">와 연결되도록 영향지표에 농가 소득 항목을 포함했습니다.</w:t>
       </w:r>
     </w:p>
     <w:p>
@@ -8931,9 +9039,9 @@
         </w:tblBorders>
       </w:tblPr>
       <w:tblGrid>
-        <w:gridCol w:w="2455"/>
-        <w:gridCol w:w="1727"/>
-        <w:gridCol w:w="5458"/>
+        <w:gridCol w:w="2682"/>
+        <w:gridCol w:w="1928"/>
+        <w:gridCol w:w="5030"/>
       </w:tblGrid>
       <w:tr>
         <w:trPr>
@@ -8941,7 +9049,7 @@
         </w:trPr>
         <w:tc>
           <w:tcPr>
-            <w:tcW w:type="dxa" w:w="2455"/>
+            <w:tcW w:type="dxa" w:w="2682"/>
             <w:shd w:fill="DCE6F1" w:color="auto" w:val="clear"/>
             <w:tcMar>
               <w:top w:type="dxa" w:w="60"/>
@@ -8969,7 +9077,7 @@
         </w:tc>
         <w:tc>
           <w:tcPr>
-            <w:tcW w:type="dxa" w:w="1727"/>
+            <w:tcW w:type="dxa" w:w="1928"/>
             <w:shd w:fill="DCE6F1" w:color="auto" w:val="clear"/>
             <w:tcMar>
               <w:top w:type="dxa" w:w="60"/>
@@ -8997,7 +9105,7 @@
         </w:tc>
         <w:tc>
           <w:tcPr>
-            <w:tcW w:type="dxa" w:w="5458"/>
+            <w:tcW w:type="dxa" w:w="5030"/>
             <w:shd w:fill="DCE6F1" w:color="auto" w:val="clear"/>
             <w:tcMar>
               <w:top w:type="dxa" w:w="60"/>
@@ -9027,7 +9135,7 @@
       <w:tr>
         <w:tc>
           <w:tcPr>
-            <w:tcW w:type="dxa" w:w="2455"/>
+            <w:tcW w:type="dxa" w:w="2682"/>
             <w:tcMar>
               <w:top w:type="dxa" w:w="60"/>
               <w:left w:type="dxa" w:w="100"/>
@@ -9052,7 +9160,7 @@
         </w:tc>
         <w:tc>
           <w:tcPr>
-            <w:tcW w:type="dxa" w:w="1727"/>
+            <w:tcW w:type="dxa" w:w="1928"/>
             <w:tcMar>
               <w:top w:type="dxa" w:w="60"/>
               <w:left w:type="dxa" w:w="100"/>
@@ -9077,7 +9185,7 @@
         </w:tc>
         <w:tc>
           <w:tcPr>
-            <w:tcW w:type="dxa" w:w="5458"/>
+            <w:tcW w:type="dxa" w:w="5030"/>
             <w:tcMar>
               <w:top w:type="dxa" w:w="60"/>
               <w:left w:type="dxa" w:w="100"/>
@@ -9104,7 +9212,7 @@
       <w:tr>
         <w:tc>
           <w:tcPr>
-            <w:tcW w:type="dxa" w:w="2455"/>
+            <w:tcW w:type="dxa" w:w="2682"/>
             <w:tcMar>
               <w:top w:type="dxa" w:w="60"/>
               <w:left w:type="dxa" w:w="100"/>
@@ -9129,7 +9237,7 @@
         </w:tc>
         <w:tc>
           <w:tcPr>
-            <w:tcW w:type="dxa" w:w="1727"/>
+            <w:tcW w:type="dxa" w:w="1928"/>
             <w:tcMar>
               <w:top w:type="dxa" w:w="60"/>
               <w:left w:type="dxa" w:w="100"/>
@@ -9154,7 +9262,7 @@
         </w:tc>
         <w:tc>
           <w:tcPr>
-            <w:tcW w:type="dxa" w:w="5458"/>
+            <w:tcW w:type="dxa" w:w="5030"/>
             <w:tcMar>
               <w:top w:type="dxa" w:w="60"/>
               <w:left w:type="dxa" w:w="100"/>
@@ -9181,32 +9289,32 @@
       <w:tr>
         <w:tc>
           <w:tcPr>
-            <w:tcW w:type="dxa" w:w="2455"/>
-            <w:tcMar>
-              <w:top w:type="dxa" w:w="60"/>
-              <w:left w:type="dxa" w:w="100"/>
-              <w:bottom w:type="dxa" w:w="60"/>
-              <w:right w:type="dxa" w:w="100"/>
-            </w:tcMar>
-          </w:tcPr>
-          <w:p>
-            <w:pPr>
-              <w:spacing w:after="0" w:line="260"/>
-              <w:jc w:val="left"/>
-            </w:pPr>
-            <w:r>
-              <w:rPr>
-                <w:rFonts w:ascii="Malgun Gothic" w:cs="Malgun Gothic" w:eastAsia="Malgun Gothic" w:hAnsi="Malgun Gothic"/>
-                <w:sz w:val="18"/>
-                <w:szCs w:val="18"/>
-              </w:rPr>
-              <w:t xml:space="preserve">대리모 체격 부족(소형 품종)</w:t>
-            </w:r>
-          </w:p>
-        </w:tc>
-        <w:tc>
-          <w:tcPr>
-            <w:tcW w:type="dxa" w:w="1727"/>
+            <w:tcW w:type="dxa" w:w="2682"/>
+            <w:tcMar>
+              <w:top w:type="dxa" w:w="60"/>
+              <w:left w:type="dxa" w:w="100"/>
+              <w:bottom w:type="dxa" w:w="60"/>
+              <w:right w:type="dxa" w:w="100"/>
+            </w:tcMar>
+          </w:tcPr>
+          <w:p>
+            <w:pPr>
+              <w:spacing w:after="0" w:line="260"/>
+              <w:jc w:val="left"/>
+            </w:pPr>
+            <w:r>
+              <w:rPr>
+                <w:rFonts w:ascii="Malgun Gothic" w:cs="Malgun Gothic" w:eastAsia="Malgun Gothic" w:hAnsi="Malgun Gothic"/>
+                <w:sz w:val="18"/>
+                <w:szCs w:val="18"/>
+              </w:rPr>
+              <w:t xml:space="preserve">대리모 체격 부족(현지 소형 품종)</w:t>
+            </w:r>
+          </w:p>
+        </w:tc>
+        <w:tc>
+          <w:tcPr>
+            <w:tcW w:type="dxa" w:w="1928"/>
             <w:tcMar>
               <w:top w:type="dxa" w:w="60"/>
               <w:left w:type="dxa" w:w="100"/>
@@ -9231,26 +9339,26 @@
         </w:tc>
         <w:tc>
           <w:tcPr>
-            <w:tcW w:type="dxa" w:w="5458"/>
-            <w:tcMar>
-              <w:top w:type="dxa" w:w="60"/>
-              <w:left w:type="dxa" w:w="100"/>
-              <w:bottom w:type="dxa" w:w="60"/>
-              <w:right w:type="dxa" w:w="100"/>
-            </w:tcMar>
-          </w:tcPr>
-          <w:p>
-            <w:pPr>
-              <w:spacing w:after="0" w:line="260"/>
-              <w:jc w:val="left"/>
-            </w:pPr>
-            <w:r>
-              <w:rPr>
-                <w:rFonts w:ascii="Malgun Gothic" w:cs="Malgun Gothic" w:eastAsia="Malgun Gothic" w:hAnsi="Malgun Gothic"/>
-                <w:sz w:val="18"/>
-                <w:szCs w:val="18"/>
-              </w:rPr>
-              <w:t xml:space="preserve">홀스타인계로 품종 한정, 체중 기준 미달 개체 제외</w:t>
+            <w:tcW w:type="dxa" w:w="5030"/>
+            <w:tcMar>
+              <w:top w:type="dxa" w:w="60"/>
+              <w:left w:type="dxa" w:w="100"/>
+              <w:bottom w:type="dxa" w:w="60"/>
+              <w:right w:type="dxa" w:w="100"/>
+            </w:tcMar>
+          </w:tcPr>
+          <w:p>
+            <w:pPr>
+              <w:spacing w:after="0" w:line="260"/>
+              <w:jc w:val="left"/>
+            </w:pPr>
+            <w:r>
+              <w:rPr>
+                <w:rFonts w:ascii="Malgun Gothic" w:cs="Malgun Gothic" w:eastAsia="Malgun Gothic" w:hAnsi="Malgun Gothic"/>
+                <w:sz w:val="18"/>
+                <w:szCs w:val="18"/>
+              </w:rPr>
+              <w:t xml:space="preserve">홀스타인계로 품종 한정, 체중 기준 미달 개체 제외, 부족 시 육성우 사양개선 후 재평가</w:t>
             </w:r>
           </w:p>
         </w:tc>
@@ -9258,76 +9366,76 @@
       <w:tr>
         <w:tc>
           <w:tcPr>
-            <w:tcW w:type="dxa" w:w="2455"/>
-            <w:tcMar>
-              <w:top w:type="dxa" w:w="60"/>
-              <w:left w:type="dxa" w:w="100"/>
-              <w:bottom w:type="dxa" w:w="60"/>
-              <w:right w:type="dxa" w:w="100"/>
-            </w:tcMar>
-          </w:tcPr>
-          <w:p>
-            <w:pPr>
-              <w:spacing w:after="0" w:line="260"/>
-              <w:jc w:val="left"/>
-            </w:pPr>
-            <w:r>
-              <w:rPr>
-                <w:rFonts w:ascii="Malgun Gothic" w:cs="Malgun Gothic" w:eastAsia="Malgun Gothic" w:hAnsi="Malgun Gothic"/>
-                <w:sz w:val="18"/>
-                <w:szCs w:val="18"/>
-              </w:rPr>
-              <w:t xml:space="preserve">수입허가 지연</w:t>
-            </w:r>
-          </w:p>
-        </w:tc>
-        <w:tc>
-          <w:tcPr>
-            <w:tcW w:type="dxa" w:w="1727"/>
-            <w:tcMar>
-              <w:top w:type="dxa" w:w="60"/>
-              <w:left w:type="dxa" w:w="100"/>
-              <w:bottom w:type="dxa" w:w="60"/>
-              <w:right w:type="dxa" w:w="100"/>
-            </w:tcMar>
-          </w:tcPr>
-          <w:p>
-            <w:pPr>
-              <w:spacing w:after="0" w:line="260"/>
-              <w:jc w:val="left"/>
-            </w:pPr>
-            <w:r>
-              <w:rPr>
-                <w:rFonts w:ascii="Malgun Gothic" w:cs="Malgun Gothic" w:eastAsia="Malgun Gothic" w:hAnsi="Malgun Gothic"/>
-                <w:sz w:val="18"/>
-                <w:szCs w:val="18"/>
-              </w:rPr>
-              <w:t xml:space="preserve">사업 일정 지연</w:t>
-            </w:r>
-          </w:p>
-        </w:tc>
-        <w:tc>
-          <w:tcPr>
-            <w:tcW w:type="dxa" w:w="5458"/>
-            <w:tcMar>
-              <w:top w:type="dxa" w:w="60"/>
-              <w:left w:type="dxa" w:w="100"/>
-              <w:bottom w:type="dxa" w:w="60"/>
-              <w:right w:type="dxa" w:w="100"/>
-            </w:tcMar>
-          </w:tcPr>
-          <w:p>
-            <w:pPr>
-              <w:spacing w:after="0" w:line="260"/>
-              <w:jc w:val="left"/>
-            </w:pPr>
-            <w:r>
-              <w:rPr>
-                <w:rFonts w:ascii="Malgun Gothic" w:cs="Malgun Gothic" w:eastAsia="Malgun Gothic" w:hAnsi="Malgun Gothic"/>
-                <w:sz w:val="18"/>
-                <w:szCs w:val="18"/>
-              </w:rPr>
-              <w:t xml:space="preserve">착수 즉시 허가 절차 개시, 요구 검사항목 사전 확정</w:t>
+            <w:tcW w:type="dxa" w:w="2682"/>
+            <w:tcMar>
+              <w:top w:type="dxa" w:w="60"/>
+              <w:left w:type="dxa" w:w="100"/>
+              <w:bottom w:type="dxa" w:w="60"/>
+              <w:right w:type="dxa" w:w="100"/>
+            </w:tcMar>
+          </w:tcPr>
+          <w:p>
+            <w:pPr>
+              <w:spacing w:after="0" w:line="260"/>
+              <w:jc w:val="left"/>
+            </w:pPr>
+            <w:r>
+              <w:rPr>
+                <w:rFonts w:ascii="Malgun Gothic" w:cs="Malgun Gothic" w:eastAsia="Malgun Gothic" w:hAnsi="Malgun Gothic"/>
+                <w:sz w:val="18"/>
+                <w:szCs w:val="18"/>
+              </w:rPr>
+              <w:t xml:space="preserve">카트만두–신둘리 5시간 이동</w:t>
+            </w:r>
+          </w:p>
+        </w:tc>
+        <w:tc>
+          <w:tcPr>
+            <w:tcW w:type="dxa" w:w="1928"/>
+            <w:tcMar>
+              <w:top w:type="dxa" w:w="60"/>
+              <w:left w:type="dxa" w:w="100"/>
+              <w:bottom w:type="dxa" w:w="60"/>
+              <w:right w:type="dxa" w:w="100"/>
+            </w:tcMar>
+          </w:tcPr>
+          <w:p>
+            <w:pPr>
+              <w:spacing w:after="0" w:line="260"/>
+              <w:jc w:val="left"/>
+            </w:pPr>
+            <w:r>
+              <w:rPr>
+                <w:rFonts w:ascii="Malgun Gothic" w:cs="Malgun Gothic" w:eastAsia="Malgun Gothic" w:hAnsi="Malgun Gothic"/>
+                <w:sz w:val="18"/>
+                <w:szCs w:val="18"/>
+              </w:rPr>
+              <w:t xml:space="preserve">LN2 보충·자재 수급 지연</w:t>
+            </w:r>
+          </w:p>
+        </w:tc>
+        <w:tc>
+          <w:tcPr>
+            <w:tcW w:type="dxa" w:w="5030"/>
+            <w:tcMar>
+              <w:top w:type="dxa" w:w="60"/>
+              <w:left w:type="dxa" w:w="100"/>
+              <w:bottom w:type="dxa" w:w="60"/>
+              <w:right w:type="dxa" w:w="100"/>
+            </w:tcMar>
+          </w:tcPr>
+          <w:p>
+            <w:pPr>
+              <w:spacing w:after="0" w:line="260"/>
+              <w:jc w:val="left"/>
+            </w:pPr>
+            <w:r>
+              <w:rPr>
+                <w:rFonts w:ascii="Malgun Gothic" w:cs="Malgun Gothic" w:eastAsia="Malgun Gothic" w:hAnsi="Malgun Gothic"/>
+                <w:sz w:val="18"/>
+                <w:szCs w:val="18"/>
+              </w:rPr>
+              <w:t xml:space="preserve">신둘리 현지 보관거점 확보, 월 정기 보충 일정 고정</w:t>
             </w:r>
           </w:p>
         </w:tc>
@@ -9335,76 +9443,76 @@
       <w:tr>
         <w:tc>
           <w:tcPr>
-            <w:tcW w:type="dxa" w:w="2455"/>
-            <w:tcMar>
-              <w:top w:type="dxa" w:w="60"/>
-              <w:left w:type="dxa" w:w="100"/>
-              <w:bottom w:type="dxa" w:w="60"/>
-              <w:right w:type="dxa" w:w="100"/>
-            </w:tcMar>
-          </w:tcPr>
-          <w:p>
-            <w:pPr>
-              <w:spacing w:after="0" w:line="260"/>
-              <w:jc w:val="left"/>
-            </w:pPr>
-            <w:r>
-              <w:rPr>
-                <w:rFonts w:ascii="Malgun Gothic" w:cs="Malgun Gothic" w:eastAsia="Malgun Gothic" w:hAnsi="Malgun Gothic"/>
-                <w:sz w:val="18"/>
-                <w:szCs w:val="18"/>
-              </w:rPr>
-              <w:t xml:space="preserve">현지 사양관리 미흡</w:t>
-            </w:r>
-          </w:p>
-        </w:tc>
-        <w:tc>
-          <w:tcPr>
-            <w:tcW w:type="dxa" w:w="1727"/>
-            <w:tcMar>
-              <w:top w:type="dxa" w:w="60"/>
-              <w:left w:type="dxa" w:w="100"/>
-              <w:bottom w:type="dxa" w:w="60"/>
-              <w:right w:type="dxa" w:w="100"/>
-            </w:tcMar>
-          </w:tcPr>
-          <w:p>
-            <w:pPr>
-              <w:spacing w:after="0" w:line="260"/>
-              <w:jc w:val="left"/>
-            </w:pPr>
-            <w:r>
-              <w:rPr>
-                <w:rFonts w:ascii="Malgun Gothic" w:cs="Malgun Gothic" w:eastAsia="Malgun Gothic" w:hAnsi="Malgun Gothic"/>
-                <w:sz w:val="18"/>
-                <w:szCs w:val="18"/>
-              </w:rPr>
-              <w:t xml:space="preserve">수태율 저하</w:t>
-            </w:r>
-          </w:p>
-        </w:tc>
-        <w:tc>
-          <w:tcPr>
-            <w:tcW w:type="dxa" w:w="5458"/>
-            <w:tcMar>
-              <w:top w:type="dxa" w:w="60"/>
-              <w:left w:type="dxa" w:w="100"/>
-              <w:bottom w:type="dxa" w:w="60"/>
-              <w:right w:type="dxa" w:w="100"/>
-            </w:tcMar>
-          </w:tcPr>
-          <w:p>
-            <w:pPr>
-              <w:spacing w:after="0" w:line="260"/>
-              <w:jc w:val="left"/>
-            </w:pPr>
-            <w:r>
-              <w:rPr>
-                <w:rFonts w:ascii="Malgun Gothic" w:cs="Malgun Gothic" w:eastAsia="Malgun Gothic" w:hAnsi="Malgun Gothic"/>
-                <w:sz w:val="18"/>
-                <w:szCs w:val="18"/>
-              </w:rPr>
-              <w:t xml:space="preserve">이식군 전용 사양 프로그램 서면 합의, 미충족 목장 제외</w:t>
+            <w:tcW w:type="dxa" w:w="2682"/>
+            <w:tcMar>
+              <w:top w:type="dxa" w:w="60"/>
+              <w:left w:type="dxa" w:w="100"/>
+              <w:bottom w:type="dxa" w:w="60"/>
+              <w:right w:type="dxa" w:w="100"/>
+            </w:tcMar>
+          </w:tcPr>
+          <w:p>
+            <w:pPr>
+              <w:spacing w:after="0" w:line="260"/>
+              <w:jc w:val="left"/>
+            </w:pPr>
+            <w:r>
+              <w:rPr>
+                <w:rFonts w:ascii="Malgun Gothic" w:cs="Malgun Gothic" w:eastAsia="Malgun Gothic" w:hAnsi="Malgun Gothic"/>
+                <w:sz w:val="18"/>
+                <w:szCs w:val="18"/>
+              </w:rPr>
+              <w:t xml:space="preserve">수입허가 지연</w:t>
+            </w:r>
+          </w:p>
+        </w:tc>
+        <w:tc>
+          <w:tcPr>
+            <w:tcW w:type="dxa" w:w="1928"/>
+            <w:tcMar>
+              <w:top w:type="dxa" w:w="60"/>
+              <w:left w:type="dxa" w:w="100"/>
+              <w:bottom w:type="dxa" w:w="60"/>
+              <w:right w:type="dxa" w:w="100"/>
+            </w:tcMar>
+          </w:tcPr>
+          <w:p>
+            <w:pPr>
+              <w:spacing w:after="0" w:line="260"/>
+              <w:jc w:val="left"/>
+            </w:pPr>
+            <w:r>
+              <w:rPr>
+                <w:rFonts w:ascii="Malgun Gothic" w:cs="Malgun Gothic" w:eastAsia="Malgun Gothic" w:hAnsi="Malgun Gothic"/>
+                <w:sz w:val="18"/>
+                <w:szCs w:val="18"/>
+              </w:rPr>
+              <w:t xml:space="preserve">사업 일정 지연</w:t>
+            </w:r>
+          </w:p>
+        </w:tc>
+        <w:tc>
+          <w:tcPr>
+            <w:tcW w:type="dxa" w:w="5030"/>
+            <w:tcMar>
+              <w:top w:type="dxa" w:w="60"/>
+              <w:left w:type="dxa" w:w="100"/>
+              <w:bottom w:type="dxa" w:w="60"/>
+              <w:right w:type="dxa" w:w="100"/>
+            </w:tcMar>
+          </w:tcPr>
+          <w:p>
+            <w:pPr>
+              <w:spacing w:after="0" w:line="260"/>
+              <w:jc w:val="left"/>
+            </w:pPr>
+            <w:r>
+              <w:rPr>
+                <w:rFonts w:ascii="Malgun Gothic" w:cs="Malgun Gothic" w:eastAsia="Malgun Gothic" w:hAnsi="Malgun Gothic"/>
+                <w:sz w:val="18"/>
+                <w:szCs w:val="18"/>
+              </w:rPr>
+              <w:t xml:space="preserve">착수 즉시 허가 절차 개시, 요구 검사항목 사전 확정</w:t>
             </w:r>
           </w:p>
         </w:tc>
@@ -9412,76 +9520,76 @@
       <w:tr>
         <w:tc>
           <w:tcPr>
-            <w:tcW w:type="dxa" w:w="2455"/>
-            <w:tcMar>
-              <w:top w:type="dxa" w:w="60"/>
-              <w:left w:type="dxa" w:w="100"/>
-              <w:bottom w:type="dxa" w:w="60"/>
-              <w:right w:type="dxa" w:w="100"/>
-            </w:tcMar>
-          </w:tcPr>
-          <w:p>
-            <w:pPr>
-              <w:spacing w:after="0" w:line="260"/>
-              <w:jc w:val="left"/>
-            </w:pPr>
-            <w:r>
-              <w:rPr>
-                <w:rFonts w:ascii="Malgun Gothic" w:cs="Malgun Gothic" w:eastAsia="Malgun Gothic" w:hAnsi="Malgun Gothic"/>
-                <w:sz w:val="18"/>
-                <w:szCs w:val="18"/>
-              </w:rPr>
-              <w:t xml:space="preserve">열 스트레스</w:t>
-            </w:r>
-          </w:p>
-        </w:tc>
-        <w:tc>
-          <w:tcPr>
-            <w:tcW w:type="dxa" w:w="1727"/>
-            <w:tcMar>
-              <w:top w:type="dxa" w:w="60"/>
-              <w:left w:type="dxa" w:w="100"/>
-              <w:bottom w:type="dxa" w:w="60"/>
-              <w:right w:type="dxa" w:w="100"/>
-            </w:tcMar>
-          </w:tcPr>
-          <w:p>
-            <w:pPr>
-              <w:spacing w:after="0" w:line="260"/>
-              <w:jc w:val="left"/>
-            </w:pPr>
-            <w:r>
-              <w:rPr>
-                <w:rFonts w:ascii="Malgun Gothic" w:cs="Malgun Gothic" w:eastAsia="Malgun Gothic" w:hAnsi="Malgun Gothic"/>
-                <w:sz w:val="18"/>
-                <w:szCs w:val="18"/>
-              </w:rPr>
-              <w:t xml:space="preserve">계절적 수태율 저하</w:t>
-            </w:r>
-          </w:p>
-        </w:tc>
-        <w:tc>
-          <w:tcPr>
-            <w:tcW w:type="dxa" w:w="5458"/>
-            <w:tcMar>
-              <w:top w:type="dxa" w:w="60"/>
-              <w:left w:type="dxa" w:w="100"/>
-              <w:bottom w:type="dxa" w:w="60"/>
-              <w:right w:type="dxa" w:w="100"/>
-            </w:tcMar>
-          </w:tcPr>
-          <w:p>
-            <w:pPr>
-              <w:spacing w:after="0" w:line="260"/>
-              <w:jc w:val="left"/>
-            </w:pPr>
-            <w:r>
-              <w:rPr>
-                <w:rFonts w:ascii="Malgun Gothic" w:cs="Malgun Gothic" w:eastAsia="Malgun Gothic" w:hAnsi="Malgun Gothic"/>
-                <w:sz w:val="18"/>
-                <w:szCs w:val="18"/>
-              </w:rPr>
-              <w:t xml:space="preserve">혹서기 회피 일정 편성, 그늘·환기 개선 선행</w:t>
+            <w:tcW w:type="dxa" w:w="2682"/>
+            <w:tcMar>
+              <w:top w:type="dxa" w:w="60"/>
+              <w:left w:type="dxa" w:w="100"/>
+              <w:bottom w:type="dxa" w:w="60"/>
+              <w:right w:type="dxa" w:w="100"/>
+            </w:tcMar>
+          </w:tcPr>
+          <w:p>
+            <w:pPr>
+              <w:spacing w:after="0" w:line="260"/>
+              <w:jc w:val="left"/>
+            </w:pPr>
+            <w:r>
+              <w:rPr>
+                <w:rFonts w:ascii="Malgun Gothic" w:cs="Malgun Gothic" w:eastAsia="Malgun Gothic" w:hAnsi="Malgun Gothic"/>
+                <w:sz w:val="18"/>
+                <w:szCs w:val="18"/>
+              </w:rPr>
+              <w:t xml:space="preserve">현지 사양관리 미흡</w:t>
+            </w:r>
+          </w:p>
+        </w:tc>
+        <w:tc>
+          <w:tcPr>
+            <w:tcW w:type="dxa" w:w="1928"/>
+            <w:tcMar>
+              <w:top w:type="dxa" w:w="60"/>
+              <w:left w:type="dxa" w:w="100"/>
+              <w:bottom w:type="dxa" w:w="60"/>
+              <w:right w:type="dxa" w:w="100"/>
+            </w:tcMar>
+          </w:tcPr>
+          <w:p>
+            <w:pPr>
+              <w:spacing w:after="0" w:line="260"/>
+              <w:jc w:val="left"/>
+            </w:pPr>
+            <w:r>
+              <w:rPr>
+                <w:rFonts w:ascii="Malgun Gothic" w:cs="Malgun Gothic" w:eastAsia="Malgun Gothic" w:hAnsi="Malgun Gothic"/>
+                <w:sz w:val="18"/>
+                <w:szCs w:val="18"/>
+              </w:rPr>
+              <w:t xml:space="preserve">수태율 저하</w:t>
+            </w:r>
+          </w:p>
+        </w:tc>
+        <w:tc>
+          <w:tcPr>
+            <w:tcW w:type="dxa" w:w="5030"/>
+            <w:tcMar>
+              <w:top w:type="dxa" w:w="60"/>
+              <w:left w:type="dxa" w:w="100"/>
+              <w:bottom w:type="dxa" w:w="60"/>
+              <w:right w:type="dxa" w:w="100"/>
+            </w:tcMar>
+          </w:tcPr>
+          <w:p>
+            <w:pPr>
+              <w:spacing w:after="0" w:line="260"/>
+              <w:jc w:val="left"/>
+            </w:pPr>
+            <w:r>
+              <w:rPr>
+                <w:rFonts w:ascii="Malgun Gothic" w:cs="Malgun Gothic" w:eastAsia="Malgun Gothic" w:hAnsi="Malgun Gothic"/>
+                <w:sz w:val="18"/>
+                <w:szCs w:val="18"/>
+              </w:rPr>
+              <w:t xml:space="preserve">이식군 전용 사양 프로그램 서면 합의, 미충족 목장 제외</w:t>
             </w:r>
           </w:p>
         </w:tc>
@@ -9489,7 +9597,84 @@
       <w:tr>
         <w:tc>
           <w:tcPr>
-            <w:tcW w:type="dxa" w:w="2455"/>
+            <w:tcW w:type="dxa" w:w="2682"/>
+            <w:tcMar>
+              <w:top w:type="dxa" w:w="60"/>
+              <w:left w:type="dxa" w:w="100"/>
+              <w:bottom w:type="dxa" w:w="60"/>
+              <w:right w:type="dxa" w:w="100"/>
+            </w:tcMar>
+          </w:tcPr>
+          <w:p>
+            <w:pPr>
+              <w:spacing w:after="0" w:line="260"/>
+              <w:jc w:val="left"/>
+            </w:pPr>
+            <w:r>
+              <w:rPr>
+                <w:rFonts w:ascii="Malgun Gothic" w:cs="Malgun Gothic" w:eastAsia="Malgun Gothic" w:hAnsi="Malgun Gothic"/>
+                <w:sz w:val="18"/>
+                <w:szCs w:val="18"/>
+              </w:rPr>
+              <w:t xml:space="preserve">열 스트레스</w:t>
+            </w:r>
+          </w:p>
+        </w:tc>
+        <w:tc>
+          <w:tcPr>
+            <w:tcW w:type="dxa" w:w="1928"/>
+            <w:tcMar>
+              <w:top w:type="dxa" w:w="60"/>
+              <w:left w:type="dxa" w:w="100"/>
+              <w:bottom w:type="dxa" w:w="60"/>
+              <w:right w:type="dxa" w:w="100"/>
+            </w:tcMar>
+          </w:tcPr>
+          <w:p>
+            <w:pPr>
+              <w:spacing w:after="0" w:line="260"/>
+              <w:jc w:val="left"/>
+            </w:pPr>
+            <w:r>
+              <w:rPr>
+                <w:rFonts w:ascii="Malgun Gothic" w:cs="Malgun Gothic" w:eastAsia="Malgun Gothic" w:hAnsi="Malgun Gothic"/>
+                <w:sz w:val="18"/>
+                <w:szCs w:val="18"/>
+              </w:rPr>
+              <w:t xml:space="preserve">계절적 수태율 저하</w:t>
+            </w:r>
+          </w:p>
+        </w:tc>
+        <w:tc>
+          <w:tcPr>
+            <w:tcW w:type="dxa" w:w="5030"/>
+            <w:tcMar>
+              <w:top w:type="dxa" w:w="60"/>
+              <w:left w:type="dxa" w:w="100"/>
+              <w:bottom w:type="dxa" w:w="60"/>
+              <w:right w:type="dxa" w:w="100"/>
+            </w:tcMar>
+          </w:tcPr>
+          <w:p>
+            <w:pPr>
+              <w:spacing w:after="0" w:line="260"/>
+              <w:jc w:val="left"/>
+            </w:pPr>
+            <w:r>
+              <w:rPr>
+                <w:rFonts w:ascii="Malgun Gothic" w:cs="Malgun Gothic" w:eastAsia="Malgun Gothic" w:hAnsi="Malgun Gothic"/>
+                <w:sz w:val="18"/>
+                <w:szCs w:val="18"/>
+              </w:rPr>
+              <w:t xml:space="preserve">혹서기 회피 일정 편성, 그늘·환기 개선 선행</w:t>
+            </w:r>
+          </w:p>
+        </w:tc>
+      </w:tr>
+      <w:tr>
+        <w:tc>
+          <w:tcPr>
+            <w:tcW w:type="dxa" w:w="2682"/>
             <w:tcMar>
               <w:top w:type="dxa" w:w="60"/>
               <w:left w:type="dxa" w:w="100"/>
@@ -9514,7 +9699,7 @@
         </w:tc>
         <w:tc>
           <w:tcPr>
-            <w:tcW w:type="dxa" w:w="1727"/>
+            <w:tcW w:type="dxa" w:w="1928"/>
             <w:tcMar>
               <w:top w:type="dxa" w:w="60"/>
               <w:left w:type="dxa" w:w="100"/>
@@ -9539,7 +9724,7 @@
         </w:tc>
         <w:tc>
           <w:tcPr>
-            <w:tcW w:type="dxa" w:w="5458"/>
+            <w:tcW w:type="dxa" w:w="5030"/>
             <w:tcMar>
               <w:top w:type="dxa" w:w="60"/>
               <w:left w:type="dxa" w:w="100"/>
@@ -10967,15 +11152,15 @@
           <w:sz w:val="20"/>
           <w:szCs w:val="20"/>
         </w:rPr>
-        <w:t xml:space="preserve">대상국 및 정식 사업명</w:t>
-      </w:r>
-      <w:r>
-        <w:rPr>
-          <w:rFonts w:ascii="Malgun Gothic" w:cs="Malgun Gothic" w:eastAsia="Malgun Gothic" w:hAnsi="Malgun Gothic"/>
-          <w:sz w:val="20"/>
-          <w:szCs w:val="20"/>
-        </w:rPr>
-        <w:t xml:space="preserve"> — 문서 내 【 】 부분 확정 필요</w:t>
+        <w:t xml:space="preserve">ET 실행기간</w:t>
+      </w:r>
+      <w:r>
+        <w:rPr>
+          <w:rFonts w:ascii="Malgun Gothic" w:cs="Malgun Gothic" w:eastAsia="Malgun Gothic" w:hAnsi="Malgun Gothic"/>
+          <w:sz w:val="20"/>
+          <w:szCs w:val="20"/>
+        </w:rPr>
+        <w:t xml:space="preserve"> — 사업기간은 2026~2030(5년)이나 요청은 "4년간 이식 두수"였습니다. 1차년도가 시설구축 위주여서 ET 실행이 4년인 것으로 보고 작성했습니다. 확정 부탁드립니다.</w:t>
       </w:r>
     </w:p>
     <w:p>
@@ -11041,7 +11226,7 @@
           <w:sz w:val="20"/>
           <w:szCs w:val="20"/>
         </w:rPr>
-        <w:t xml:space="preserve">대상 목장 수 및 현지 미경산 처녀소(홀스타인계, 15~18개월령) 보유 두수</w:t>
+        <w:t xml:space="preserve">신둘리 카말라마이시 대상 목장 수 및 미경산 처녀소(홀스타인계, 15~18개월령) 보유 두수</w:t>
       </w:r>
       <w:r>
         <w:rPr>
@@ -11067,7 +11252,25 @@
           <w:sz w:val="20"/>
           <w:szCs w:val="20"/>
         </w:rPr>
-        <w:t xml:space="preserve">입니다. 현지 사육 품종이 홀스타인계가 아닌 경우, 대리모 확보 방안을 별도 협의해야 합니다.</w:t>
+        <w:t xml:space="preserve">입니다. 네팔은 물소·재래종 비중이 높고 홀스타인 교잡종(HF cross)이 혼재하므로, </w:t>
+      </w:r>
+      <w:r>
+        <w:rPr>
+          <w:rFonts w:ascii="Malgun Gothic" w:cs="Malgun Gothic" w:eastAsia="Malgun Gothic" w:hAnsi="Malgun Gothic"/>
+          <w:b/>
+          <w:bCs/>
+          <w:sz w:val="20"/>
+          <w:szCs w:val="20"/>
+        </w:rPr>
+        <w:t xml:space="preserve">대리모로 쓸 수 있는 체격의 개체가 실제로 몇 두인지가 본 파트의 최대 변수</w:t>
+      </w:r>
+      <w:r>
+        <w:rPr>
+          <w:rFonts w:ascii="Malgun Gothic" w:cs="Malgun Gothic" w:eastAsia="Malgun Gothic" w:hAnsi="Malgun Gothic"/>
+          <w:sz w:val="20"/>
+          <w:szCs w:val="20"/>
+        </w:rPr>
+        <w:t xml:space="preserve">입니다. 2026.04 예비조사 자료에 축우 품종·두수 정보가 있다면 공유 부탁드립니다.</w:t>
       </w:r>
     </w:p>
     <w:p>
@@ -11087,15 +11290,15 @@
           <w:sz w:val="20"/>
           <w:szCs w:val="20"/>
         </w:rPr>
-        <w:t xml:space="preserve">KOICA PDM 양식 및 성과지표 요구사항</w:t>
-      </w:r>
-      <w:r>
-        <w:rPr>
-          <w:rFonts w:ascii="Malgun Gothic" w:cs="Malgun Gothic" w:eastAsia="Malgun Gothic" w:hAnsi="Malgun Gothic"/>
-          <w:sz w:val="20"/>
-          <w:szCs w:val="20"/>
-        </w:rPr>
-        <w:t xml:space="preserve"> — 확정 양식을 주시면 4장 KPI를 PDM 칸(지표·측정수단·전제조건)에 맞춰 재배치해 드리겠습니다. 수원국 역량강화 지표(현지 인력 단독 이식 비율)와 지속가능성 지표는 이미 반영해 두었습니다.</w:t>
+        <w:t xml:space="preserve">발주처 요구 성과관리 양식</w:t>
+      </w:r>
+      <w:r>
+        <w:rPr>
+          <w:rFonts w:ascii="Malgun Gothic" w:cs="Malgun Gothic" w:eastAsia="Malgun Gothic" w:hAnsi="Malgun Gothic"/>
+          <w:sz w:val="20"/>
+          <w:szCs w:val="20"/>
+        </w:rPr>
+        <w:t xml:space="preserve"> — 확정 양식을 주시면 4장 KPI를 해당 칸(지표· 측정수단·전제조건)에 맞춰 재배치해 드리겠습니다. 수원국 역량강화 지표(현지 인력 단독 이식 비율)와 지속가능성 지표는 이미 반영해 두었습니다.</w:t>
       </w:r>
     </w:p>
     <w:p>
@@ -11254,7 +11457,7 @@
         <w:sz w:val="16"/>
         <w:szCs w:val="16"/>
       </w:rPr>
-      <w:t xml:space="preserve">KOICA 사업 ET 파트 수행계획</w:t>
+      <w:t xml:space="preserve">네팔 신둘리 낙농사업 PMC · ET 파트</w:t>
     </w:r>
   </w:p>
 </w:hdr>

</xml_diff>